<commit_message>
Update MaiaEdge content from Cooper (2026-06-29)
</commit_message>
<xml_diff>
--- a/26 comp plans/comp-plan-ken-cunningham-2026-v3.docx
+++ b/26 comp plans/comp-plan-ken-cunningham-2026-v3.docx
@@ -503,7 +503,7 @@
                 <w:sz w:val="20"/>
                 <w:szCs w:val="20"/>
               </w:rPr>
-              <w:t xml:space="preserve">$121,537</w:t>
+              <w:t xml:space="preserve">$86,662</w:t>
             </w:r>
           </w:p>
         </w:tc>
@@ -1278,7 +1278,7 @@
           <w:sz w:val="22"/>
           <w:szCs w:val="22"/>
         </w:rPr>
-        <w:t xml:space="preserve">Base Rate = Prorated Variable at 100% / Annual Quota = $121,537 / $2,050,000 = 5.93% (Variable prorated 318/365 days from February 17, 2026 start date)</w:t>
+        <w:t xml:space="preserve">Base Rate = Prorated Variable at 100% / Annual Quota = $121,537 / $2,050,000 = 4.23% (Variable prorated 318/365 days from February 17, 2026 start date)</w:t>
       </w:r>
     </w:p>
     <w:p>
@@ -1506,7 +1506,7 @@
                 <w:sz w:val="20"/>
                 <w:szCs w:val="20"/>
               </w:rPr>
-              <w:t xml:space="preserve">5.93% (flat rate)</w:t>
+              <w:t xml:space="preserve">4.23% (flat rate)</w:t>
             </w:r>
           </w:p>
         </w:tc>
@@ -2071,7 +2071,7 @@
                 <w:sz w:val="20"/>
                 <w:szCs w:val="20"/>
               </w:rPr>
-              <w:t xml:space="preserve">$121,537</w:t>
+              <w:t xml:space="preserve">$86,662</w:t>
             </w:r>
           </w:p>
         </w:tc>
@@ -2241,7 +2241,7 @@
                 <w:sz w:val="20"/>
                 <w:szCs w:val="20"/>
               </w:rPr>
-              <w:t xml:space="preserve">Commission-Earnable Variable (= Prorated Variable)</w:t>
+              <w:t xml:space="preserve">Commission-Earnable Variable (Prorated Variable minus H2 Non-Recoverable Draw)</w:t>
             </w:r>
           </w:p>
         </w:tc>
@@ -2272,7 +2272,7 @@
                 <w:sz w:val="20"/>
                 <w:szCs w:val="20"/>
               </w:rPr>
-              <w:t xml:space="preserve">$121,537</w:t>
+              <w:t xml:space="preserve">$86,662</w:t>
             </w:r>
           </w:p>
         </w:tc>
@@ -2339,7 +2339,7 @@
                 <w:sz w:val="20"/>
                 <w:szCs w:val="20"/>
               </w:rPr>
-              <w:t xml:space="preserve">5.93% (Prorated Variable at 100% / Annual Quota = $121,537 / $2,050,000)</w:t>
+              <w:t xml:space="preserve">4.23% (Prorated Variable at 100% / Annual Quota = $121,537 / $2,050,000)</w:t>
             </w:r>
           </w:p>
         </w:tc>

</xml_diff>